<commit_message>
feat(dao): modeles de travaux rebranches sur la livraison backend du 02/10 (B3) ; fiche 40 rejouee en v2, B1/B2/B4 conformes
- DPAO-T : beneficiaire du cheque B05-GQ-04, heure d'ouverture {{B04-OV-02.heure}}, « copie(s) »
- AE-T : {{DERIVE.date-dao}} (preambule) et {{DERIVE.date-prix}} (art. 2)
- CCAP-T : B05-GQ-04 (7.1), actualisation sous ACTUALISATION (B05-VR-02 renseigne), B08-RE-04, B08-MR-05,
  decoupage du forfait B08-MR-06 a la place des lignes d'exemple, plafond B09-PE-03, « {{B09-RP-03}} jours »,
  annexe des Specifications sans <n°>
- fidelite DPAO-T 262/262, AE-T 363/363, CCAP-T 574/574 ; banc 13 passes : Q10 tenu, 0 deduction fausse
- demande §B5 : constat de la v2 et modeles a recopier pour la contre-recette de B3 ; fiche des faits : valeurs de la v2

Co-Authored-By: Claude Opus 5.5 (1M context) <noreply@anthropic.com>
</commit_message>
<xml_diff>
--- a/docs/modeles-dao/AE-T.docx
+++ b/docs/modeles-dao/AE-T.docx
@@ -798,7 +798,7 @@
           <w:b w:val="off"/>
           <w:sz w:val="22"/>
         </w:rPr>
-        <w:t>Après avoir pris connaissance du Dossier d'Appel d'Offres N° {{B02-OB-03}} du &lt;date&gt; et, en particulier, des documents composant le Cahier des Prescriptions Spéciales :</w:t>
+        <w:t>Après avoir pris connaissance du Dossier d'Appel d'Offres N° {{B02-OB-03}} du {{DERIVE.date-dao}} et, en particulier, des documents composant le Cahier des Prescriptions Spéciales :</w:t>
       </w:r>
     </w:p>
     <w:p>
@@ -1552,7 +1552,7 @@
           <w:b w:val="off"/>
           <w:sz w:val="22"/>
         </w:rPr>
-        <w:t>Après avoir pris connaissance du Dossier d'Appel d'Offres N° {{B02-OB-03}} du &lt;date&gt; et, en particulier, des documents composant le Cahier des Prescriptions Spéciales :</w:t>
+        <w:t>Après avoir pris connaissance du Dossier d'Appel d'Offres N° {{B02-OB-03}} du {{DERIVE.date-dao}} et, en particulier, des documents composant le Cahier des Prescriptions Spéciales :</w:t>
       </w:r>
     </w:p>
     <w:p>
@@ -1747,7 +1747,7 @@
           <w:b w:val="off"/>
           <w:sz w:val="22"/>
         </w:rPr>
-        <w:t>Les conditions d'établissement des prix sont celles existant le quinzième jour précédant la date limite fixée pour la remise des offres, soit le…………</w:t>
+        <w:t>Les conditions d'établissement des prix sont celles existant le quinzième jour précédant la date limite fixée pour la remise des offres, soit le {{DERIVE.date-prix}}</w:t>
       </w:r>
     </w:p>
     <w:p>

</xml_diff>

<commit_message>
feat(dao): fiche 40 rejouee en v3, blancs de B3 remplis ; AE-T : renvois a l'annexe n° 1 et a l'article 16 du CCAP (sort « renvoi »)
- v3 = revision de la v2 sans changement de valeur, validee : DPAO, AE et CCAP sans les blancs de B3 ;
  restent les trois pointilles attendus (B02-MW-02, B08-MR-05, B09-PE-03) et l'art. 25 (B09-PM-01 vide, de mon fait)
- decrire.mjs : sixieme sort de trou « renvoi » (numero fixe par nos modeles ; garde-fou : rien qu'un nombre hors
  les mots du trou), documente dans le README ; compte dans le bilan
- AE-T 363/363 ; banc 13 passes : Q10 tenu, 0 deduction fausse
- demande §B6 : constat de la v3, AE-T a recopier, suggestion de libelle pour B05-GQ-04

Co-Authored-By: Claude Opus 5.5 (1M context) <noreply@anthropic.com>
</commit_message>
<xml_diff>
--- a/docs/modeles-dao/AE-T.docx
+++ b/docs/modeles-dao/AE-T.docx
@@ -1890,7 +1890,7 @@
           <w:b w:val="off"/>
           <w:sz w:val="22"/>
         </w:rPr>
-        <w:t>Les Travaux, objet du présent marché, seront rémunérés, par application des prix unitaires qui résultent du bordereau des prix unitaires et du détail quantitatif et estimatif figurant en Annexe &lt;N° de l'Annexe&gt; au présent Acte d'Engagement, aux quantités réellement exécutées prises en attachement contradictoire.</w:t>
+        <w:t>Les Travaux, objet du présent marché, seront rémunérés, par application des prix unitaires qui résultent du bordereau des prix unitaires et du détail quantitatif et estimatif figurant en Annexe n° 1 au présent Acte d'Engagement, aux quantités réellement exécutées prises en attachement contradictoire.</w:t>
       </w:r>
     </w:p>
     <w:p>
@@ -1981,7 +1981,7 @@
           <w:b w:val="off"/>
           <w:sz w:val="22"/>
         </w:rPr>
-        <w:t>Les Travaux, objet du présent marché, seront rémunérées par application du prix forfaitaire résultant du détail quantitatif et estimatif figurant en Annexe &lt;N° de l’Annexe&gt; selon le découpage en centième par corps d’état des travaux terminés, prévu à l’article…. du CCAP</w:t>
+        <w:t>Les Travaux, objet du présent marché, seront rémunérées par application du prix forfaitaire résultant du détail quantitatif et estimatif figurant en Annexe n° 1 selon le découpage en centième par corps d’état des travaux terminés, prévu à l’article 16 du CCAP</w:t>
       </w:r>
     </w:p>
     <w:p>
@@ -2358,7 +2358,7 @@
           <w:b w:val="off"/>
           <w:sz w:val="22"/>
         </w:rPr>
-        <w:t>Les Travaux, objet du présent marché, seront rémunérés, par application du prix forfaitaire résultant du détail quantitatif et estimatif selon le découpage en centième par corps d’état des travaux terminés, prévu à l’article…. du CCAP</w:t>
+        <w:t>Les Travaux, objet du présent marché, seront rémunérés, par application du prix forfaitaire résultant du détail quantitatif et estimatif selon le découpage en centième par corps d’état des travaux terminés, prévu à l’article 16 du CCAP</w:t>
       </w:r>
     </w:p>
     <w:p>

</xml_diff>